<commit_message>
update(ex2): apply text stress test and fix it
</commit_message>
<xml_diff>
--- a/Chapter02/23635991_ToNguyenAnThuyen_BaiTapChuong2.docx
+++ b/Chapter02/23635991_ToNguyenAnThuyen_BaiTapChuong2.docx
@@ -4,6 +4,7 @@
   <w:body>
     <w:p>
       <w:pPr>
+        <w:jc w:val="both"/>
         <w:rPr>
           <w:rFonts w:asciiTheme="majorHAnsi" w:hAnsiTheme="majorHAnsi" w:cstheme="majorHAnsi"/>
           <w:sz w:val="26"/>
@@ -21,6 +22,7 @@
     </w:p>
     <w:p>
       <w:pPr>
+        <w:jc w:val="both"/>
         <w:rPr>
           <w:rFonts w:asciiTheme="majorHAnsi" w:hAnsiTheme="majorHAnsi" w:cstheme="majorHAnsi"/>
           <w:sz w:val="26"/>
@@ -38,6 +40,7 @@
     </w:p>
     <w:p>
       <w:pPr>
+        <w:jc w:val="both"/>
         <w:rPr>
           <w:rFonts w:asciiTheme="majorHAnsi" w:hAnsiTheme="majorHAnsi" w:cstheme="majorHAnsi"/>
           <w:sz w:val="26"/>
@@ -71,6 +74,7 @@
     </w:p>
     <w:p>
       <w:pPr>
+        <w:jc w:val="both"/>
         <w:rPr>
           <w:rFonts w:asciiTheme="majorHAnsi" w:hAnsiTheme="majorHAnsi" w:cstheme="majorHAnsi"/>
           <w:sz w:val="26"/>
@@ -85,7 +89,7 @@
         </w:rPr>
         <w:t xml:space="preserve">Link github: </w:t>
       </w:r>
-      <w:hyperlink r:id="rId4" w:history="1">
+      <w:hyperlink r:id="rId5" w:history="1">
         <w:r>
           <w:rPr>
             <w:rStyle w:val="Hyperlink"/>
@@ -93,31 +97,13 @@
             <w:sz w:val="26"/>
             <w:szCs w:val="26"/>
           </w:rPr>
-          <w:t>thuyenvie/mobile-dev-4203001432</w:t>
-        </w:r>
-        <w:r>
-          <w:rPr>
-            <w:rStyle w:val="Hyperlink"/>
-            <w:rFonts w:asciiTheme="majorHAnsi" w:hAnsiTheme="majorHAnsi" w:cstheme="majorHAnsi"/>
-            <w:sz w:val="26"/>
-            <w:szCs w:val="26"/>
-          </w:rPr>
-          <w:t>0</w:t>
-        </w:r>
-        <w:r>
-          <w:rPr>
-            <w:rStyle w:val="Hyperlink"/>
-            <w:rFonts w:asciiTheme="majorHAnsi" w:hAnsiTheme="majorHAnsi" w:cstheme="majorHAnsi"/>
-            <w:sz w:val="26"/>
-            <w:szCs w:val="26"/>
-          </w:rPr>
-          <w:t>1-23635991</w:t>
+          <w:t>thuyenvie/mobile-dev-420300143201-23635991</w:t>
         </w:r>
       </w:hyperlink>
     </w:p>
     <w:p>
       <w:pPr>
-        <w:jc w:val="center"/>
+        <w:jc w:val="both"/>
         <w:rPr>
           <w:rFonts w:asciiTheme="majorHAnsi" w:hAnsiTheme="majorHAnsi" w:cstheme="majorHAnsi"/>
           <w:color w:val="EE0000"/>
@@ -146,6 +132,7 @@
     </w:p>
     <w:p>
       <w:pPr>
+        <w:jc w:val="both"/>
         <w:rPr>
           <w:rFonts w:asciiTheme="majorHAnsi" w:hAnsiTheme="majorHAnsi" w:cstheme="majorHAnsi"/>
           <w:b/>
@@ -167,6 +154,7 @@
     </w:p>
     <w:p>
       <w:pPr>
+        <w:jc w:val="both"/>
         <w:rPr>
           <w:rFonts w:asciiTheme="majorHAnsi" w:hAnsiTheme="majorHAnsi" w:cstheme="majorHAnsi"/>
           <w:b/>
@@ -188,6 +176,7 @@
     </w:p>
     <w:p>
       <w:pPr>
+        <w:jc w:val="both"/>
         <w:rPr>
           <w:rFonts w:asciiTheme="majorHAnsi" w:hAnsiTheme="majorHAnsi" w:cstheme="majorHAnsi"/>
           <w:b/>
@@ -209,15 +198,17 @@
     </w:p>
     <w:p>
       <w:pPr>
-        <w:rPr>
-          <w:rFonts w:asciiTheme="majorHAnsi" w:hAnsiTheme="majorHAnsi" w:cstheme="majorHAnsi"/>
-          <w:sz w:val="26"/>
-          <w:szCs w:val="26"/>
-        </w:rPr>
-      </w:pPr>
-      <w:r>
-        <w:rPr>
-          <w:rFonts w:asciiTheme="majorHAnsi" w:hAnsiTheme="majorHAnsi" w:cstheme="majorHAnsi"/>
+        <w:jc w:val="both"/>
+        <w:rPr>
+          <w:rFonts w:asciiTheme="majorHAnsi" w:hAnsiTheme="majorHAnsi" w:cstheme="majorHAnsi"/>
+          <w:sz w:val="26"/>
+          <w:szCs w:val="26"/>
+        </w:rPr>
+      </w:pPr>
+      <w:r>
+        <w:rPr>
+          <w:rFonts w:asciiTheme="majorHAnsi" w:hAnsiTheme="majorHAnsi" w:cstheme="majorHAnsi"/>
+          <w:noProof/>
           <w:sz w:val="26"/>
           <w:szCs w:val="26"/>
         </w:rPr>
@@ -237,7 +228,7 @@
                     <pic:cNvPicPr/>
                   </pic:nvPicPr>
                   <pic:blipFill>
-                    <a:blip r:embed="rId5"/>
+                    <a:blip r:embed="rId6"/>
                     <a:stretch>
                       <a:fillRect/>
                     </a:stretch>
@@ -260,7 +251,24 @@
     </w:p>
     <w:p>
       <w:pPr>
+        <w:jc w:val="center"/>
+        <w:rPr>
+          <w:rStyle w:val="SubtleEmphasis"/>
+          <w:rFonts w:asciiTheme="majorHAnsi" w:hAnsiTheme="majorHAnsi" w:cstheme="majorHAnsi"/>
+        </w:rPr>
+      </w:pPr>
+      <w:r>
+        <w:rPr>
+          <w:rStyle w:val="SubtleEmphasis"/>
+          <w:rFonts w:asciiTheme="majorHAnsi" w:hAnsiTheme="majorHAnsi" w:cstheme="majorHAnsi"/>
+        </w:rPr>
+        <w:t>Hình 1: mô phỏng campus dashboard</w:t>
+      </w:r>
+    </w:p>
+    <w:p>
+      <w:pPr>
         <w:ind w:firstLine="720"/>
+        <w:jc w:val="both"/>
         <w:rPr>
           <w:rFonts w:asciiTheme="majorHAnsi" w:hAnsiTheme="majorHAnsi" w:cstheme="majorHAnsi"/>
           <w:sz w:val="26"/>
@@ -294,6 +302,7 @@
     </w:p>
     <w:p>
       <w:pPr>
+        <w:jc w:val="both"/>
         <w:rPr>
           <w:rFonts w:asciiTheme="majorHAnsi" w:hAnsiTheme="majorHAnsi" w:cstheme="majorHAnsi"/>
           <w:sz w:val="26"/>
@@ -312,6 +321,7 @@
     <w:p>
       <w:pPr>
         <w:ind w:firstLine="720"/>
+        <w:jc w:val="both"/>
         <w:rPr>
           <w:rFonts w:asciiTheme="majorHAnsi" w:hAnsiTheme="majorHAnsi" w:cstheme="majorHAnsi"/>
           <w:sz w:val="26"/>
@@ -338,6 +348,7 @@
           </w:tcPr>
           <w:p>
             <w:pPr>
+              <w:jc w:val="both"/>
               <w:rPr>
                 <w:rFonts w:asciiTheme="majorHAnsi" w:hAnsiTheme="majorHAnsi" w:cstheme="majorHAnsi"/>
                 <w:b/>
@@ -364,6 +375,7 @@
           </w:tcPr>
           <w:p>
             <w:pPr>
+              <w:jc w:val="both"/>
               <w:rPr>
                 <w:rFonts w:asciiTheme="majorHAnsi" w:hAnsiTheme="majorHAnsi" w:cstheme="majorHAnsi"/>
                 <w:b/>
@@ -390,6 +402,7 @@
           </w:tcPr>
           <w:p>
             <w:pPr>
+              <w:jc w:val="both"/>
               <w:rPr>
                 <w:rFonts w:asciiTheme="majorHAnsi" w:hAnsiTheme="majorHAnsi" w:cstheme="majorHAnsi"/>
                 <w:b/>
@@ -418,6 +431,7 @@
           </w:tcPr>
           <w:p>
             <w:pPr>
+              <w:jc w:val="both"/>
               <w:rPr>
                 <w:rFonts w:asciiTheme="majorHAnsi" w:hAnsiTheme="majorHAnsi" w:cstheme="majorHAnsi"/>
                 <w:sz w:val="26"/>
@@ -440,6 +454,7 @@
           </w:tcPr>
           <w:p>
             <w:pPr>
+              <w:jc w:val="both"/>
               <w:rPr>
                 <w:rFonts w:asciiTheme="majorHAnsi" w:hAnsiTheme="majorHAnsi" w:cstheme="majorHAnsi"/>
                 <w:sz w:val="26"/>
@@ -462,6 +477,7 @@
           </w:tcPr>
           <w:p>
             <w:pPr>
+              <w:jc w:val="both"/>
               <w:rPr>
                 <w:rFonts w:asciiTheme="majorHAnsi" w:hAnsiTheme="majorHAnsi" w:cstheme="majorHAnsi"/>
                 <w:sz w:val="26"/>
@@ -486,6 +502,7 @@
           </w:tcPr>
           <w:p>
             <w:pPr>
+              <w:jc w:val="both"/>
               <w:rPr>
                 <w:rFonts w:asciiTheme="majorHAnsi" w:hAnsiTheme="majorHAnsi" w:cstheme="majorHAnsi"/>
                 <w:sz w:val="26"/>
@@ -508,6 +525,7 @@
           </w:tcPr>
           <w:p>
             <w:pPr>
+              <w:jc w:val="both"/>
               <w:rPr>
                 <w:rFonts w:asciiTheme="majorHAnsi" w:hAnsiTheme="majorHAnsi" w:cstheme="majorHAnsi"/>
                 <w:sz w:val="26"/>
@@ -530,6 +548,7 @@
           </w:tcPr>
           <w:p>
             <w:pPr>
+              <w:jc w:val="both"/>
               <w:rPr>
                 <w:rFonts w:asciiTheme="majorHAnsi" w:hAnsiTheme="majorHAnsi" w:cstheme="majorHAnsi"/>
                 <w:sz w:val="26"/>
@@ -554,6 +573,7 @@
           </w:tcPr>
           <w:p>
             <w:pPr>
+              <w:jc w:val="both"/>
               <w:rPr>
                 <w:rFonts w:asciiTheme="majorHAnsi" w:hAnsiTheme="majorHAnsi" w:cstheme="majorHAnsi"/>
                 <w:sz w:val="26"/>
@@ -576,6 +596,7 @@
           </w:tcPr>
           <w:p>
             <w:pPr>
+              <w:jc w:val="both"/>
               <w:rPr>
                 <w:rFonts w:asciiTheme="majorHAnsi" w:hAnsiTheme="majorHAnsi" w:cstheme="majorHAnsi"/>
                 <w:sz w:val="26"/>
@@ -598,6 +619,7 @@
           </w:tcPr>
           <w:p>
             <w:pPr>
+              <w:jc w:val="both"/>
               <w:rPr>
                 <w:rFonts w:asciiTheme="majorHAnsi" w:hAnsiTheme="majorHAnsi" w:cstheme="majorHAnsi"/>
                 <w:sz w:val="26"/>
@@ -622,6 +644,7 @@
           </w:tcPr>
           <w:p>
             <w:pPr>
+              <w:jc w:val="both"/>
               <w:rPr>
                 <w:rFonts w:asciiTheme="majorHAnsi" w:hAnsiTheme="majorHAnsi" w:cstheme="majorHAnsi"/>
                 <w:sz w:val="26"/>
@@ -644,6 +667,7 @@
           </w:tcPr>
           <w:p>
             <w:pPr>
+              <w:jc w:val="both"/>
               <w:rPr>
                 <w:rFonts w:asciiTheme="majorHAnsi" w:hAnsiTheme="majorHAnsi" w:cstheme="majorHAnsi"/>
                 <w:sz w:val="26"/>
@@ -666,6 +690,7 @@
           </w:tcPr>
           <w:p>
             <w:pPr>
+              <w:jc w:val="both"/>
               <w:rPr>
                 <w:rFonts w:asciiTheme="majorHAnsi" w:hAnsiTheme="majorHAnsi" w:cstheme="majorHAnsi"/>
                 <w:sz w:val="26"/>
@@ -690,6 +715,7 @@
           </w:tcPr>
           <w:p>
             <w:pPr>
+              <w:jc w:val="both"/>
               <w:rPr>
                 <w:rFonts w:asciiTheme="majorHAnsi" w:hAnsiTheme="majorHAnsi" w:cstheme="majorHAnsi"/>
                 <w:sz w:val="26"/>
@@ -712,6 +738,7 @@
           </w:tcPr>
           <w:p>
             <w:pPr>
+              <w:jc w:val="both"/>
               <w:rPr>
                 <w:rFonts w:asciiTheme="majorHAnsi" w:hAnsiTheme="majorHAnsi" w:cstheme="majorHAnsi"/>
                 <w:sz w:val="26"/>
@@ -734,6 +761,7 @@
           </w:tcPr>
           <w:p>
             <w:pPr>
+              <w:jc w:val="both"/>
               <w:rPr>
                 <w:rFonts w:asciiTheme="majorHAnsi" w:hAnsiTheme="majorHAnsi" w:cstheme="majorHAnsi"/>
                 <w:sz w:val="26"/>
@@ -758,6 +786,7 @@
           </w:tcPr>
           <w:p>
             <w:pPr>
+              <w:jc w:val="both"/>
               <w:rPr>
                 <w:rFonts w:asciiTheme="majorHAnsi" w:hAnsiTheme="majorHAnsi" w:cstheme="majorHAnsi"/>
                 <w:sz w:val="26"/>
@@ -780,6 +809,7 @@
           </w:tcPr>
           <w:p>
             <w:pPr>
+              <w:jc w:val="both"/>
               <w:rPr>
                 <w:rFonts w:asciiTheme="majorHAnsi" w:hAnsiTheme="majorHAnsi" w:cstheme="majorHAnsi"/>
                 <w:sz w:val="26"/>
@@ -802,6 +832,7 @@
           </w:tcPr>
           <w:p>
             <w:pPr>
+              <w:jc w:val="both"/>
               <w:rPr>
                 <w:rFonts w:asciiTheme="majorHAnsi" w:hAnsiTheme="majorHAnsi" w:cstheme="majorHAnsi"/>
                 <w:sz w:val="26"/>
@@ -826,6 +857,7 @@
           </w:tcPr>
           <w:p>
             <w:pPr>
+              <w:jc w:val="both"/>
               <w:rPr>
                 <w:rFonts w:asciiTheme="majorHAnsi" w:hAnsiTheme="majorHAnsi" w:cstheme="majorHAnsi"/>
                 <w:sz w:val="26"/>
@@ -848,6 +880,7 @@
           </w:tcPr>
           <w:p>
             <w:pPr>
+              <w:jc w:val="both"/>
               <w:rPr>
                 <w:rFonts w:asciiTheme="majorHAnsi" w:hAnsiTheme="majorHAnsi" w:cstheme="majorHAnsi"/>
                 <w:sz w:val="26"/>
@@ -870,6 +903,7 @@
           </w:tcPr>
           <w:p>
             <w:pPr>
+              <w:jc w:val="both"/>
               <w:rPr>
                 <w:rFonts w:asciiTheme="majorHAnsi" w:hAnsiTheme="majorHAnsi" w:cstheme="majorHAnsi"/>
                 <w:sz w:val="26"/>
@@ -894,6 +928,7 @@
           </w:tcPr>
           <w:p>
             <w:pPr>
+              <w:jc w:val="both"/>
               <w:rPr>
                 <w:rFonts w:asciiTheme="majorHAnsi" w:hAnsiTheme="majorHAnsi" w:cstheme="majorHAnsi"/>
                 <w:sz w:val="26"/>
@@ -916,6 +951,7 @@
           </w:tcPr>
           <w:p>
             <w:pPr>
+              <w:jc w:val="both"/>
               <w:rPr>
                 <w:rFonts w:asciiTheme="majorHAnsi" w:hAnsiTheme="majorHAnsi" w:cstheme="majorHAnsi"/>
                 <w:sz w:val="26"/>
@@ -938,6 +974,7 @@
           </w:tcPr>
           <w:p>
             <w:pPr>
+              <w:jc w:val="both"/>
               <w:rPr>
                 <w:rFonts w:asciiTheme="majorHAnsi" w:hAnsiTheme="majorHAnsi" w:cstheme="majorHAnsi"/>
                 <w:sz w:val="26"/>
@@ -962,6 +999,7 @@
           </w:tcPr>
           <w:p>
             <w:pPr>
+              <w:jc w:val="both"/>
               <w:rPr>
                 <w:rFonts w:asciiTheme="majorHAnsi" w:hAnsiTheme="majorHAnsi" w:cstheme="majorHAnsi"/>
                 <w:sz w:val="26"/>
@@ -984,6 +1022,7 @@
           </w:tcPr>
           <w:p>
             <w:pPr>
+              <w:jc w:val="both"/>
               <w:rPr>
                 <w:rFonts w:asciiTheme="majorHAnsi" w:hAnsiTheme="majorHAnsi" w:cstheme="majorHAnsi"/>
                 <w:sz w:val="26"/>
@@ -1006,6 +1045,7 @@
           </w:tcPr>
           <w:p>
             <w:pPr>
+              <w:jc w:val="both"/>
               <w:rPr>
                 <w:rFonts w:asciiTheme="majorHAnsi" w:hAnsiTheme="majorHAnsi" w:cstheme="majorHAnsi"/>
                 <w:sz w:val="26"/>
@@ -1030,6 +1070,7 @@
           </w:tcPr>
           <w:p>
             <w:pPr>
+              <w:jc w:val="both"/>
               <w:rPr>
                 <w:rFonts w:asciiTheme="majorHAnsi" w:hAnsiTheme="majorHAnsi" w:cstheme="majorHAnsi"/>
                 <w:sz w:val="26"/>
@@ -1052,6 +1093,7 @@
           </w:tcPr>
           <w:p>
             <w:pPr>
+              <w:jc w:val="both"/>
               <w:rPr>
                 <w:rFonts w:asciiTheme="majorHAnsi" w:hAnsiTheme="majorHAnsi" w:cstheme="majorHAnsi"/>
                 <w:sz w:val="26"/>
@@ -1074,6 +1116,7 @@
           </w:tcPr>
           <w:p>
             <w:pPr>
+              <w:jc w:val="both"/>
               <w:rPr>
                 <w:rFonts w:asciiTheme="majorHAnsi" w:hAnsiTheme="majorHAnsi" w:cstheme="majorHAnsi"/>
                 <w:sz w:val="26"/>
@@ -1094,15 +1137,17 @@
     </w:tbl>
     <w:p>
       <w:pPr>
-        <w:rPr>
-          <w:rFonts w:asciiTheme="majorHAnsi" w:hAnsiTheme="majorHAnsi" w:cstheme="majorHAnsi"/>
-          <w:sz w:val="26"/>
-          <w:szCs w:val="26"/>
-        </w:rPr>
-      </w:pPr>
-    </w:p>
-    <w:p>
-      <w:pPr>
+        <w:jc w:val="both"/>
+        <w:rPr>
+          <w:rFonts w:asciiTheme="majorHAnsi" w:hAnsiTheme="majorHAnsi" w:cstheme="majorHAnsi"/>
+          <w:sz w:val="26"/>
+          <w:szCs w:val="26"/>
+        </w:rPr>
+      </w:pPr>
+    </w:p>
+    <w:p>
+      <w:pPr>
+        <w:jc w:val="both"/>
         <w:rPr>
           <w:rFonts w:asciiTheme="majorHAnsi" w:hAnsiTheme="majorHAnsi" w:cstheme="majorHAnsi"/>
           <w:b/>
@@ -1134,6 +1179,7 @@
     </w:p>
     <w:p>
       <w:pPr>
+        <w:jc w:val="both"/>
         <w:rPr>
           <w:rFonts w:asciiTheme="majorHAnsi" w:hAnsiTheme="majorHAnsi" w:cstheme="majorHAnsi"/>
           <w:b/>
@@ -1155,6 +1201,7 @@
     </w:p>
     <w:p>
       <w:pPr>
+        <w:jc w:val="both"/>
         <w:rPr>
           <w:rFonts w:asciiTheme="majorHAnsi" w:hAnsiTheme="majorHAnsi" w:cstheme="majorHAnsi"/>
           <w:sz w:val="26"/>
@@ -1172,6 +1219,7 @@
     </w:p>
     <w:p>
       <w:pPr>
+        <w:jc w:val="both"/>
         <w:rPr>
           <w:rFonts w:asciiTheme="majorHAnsi" w:hAnsiTheme="majorHAnsi" w:cstheme="majorHAnsi"/>
           <w:sz w:val="26"/>
@@ -1189,6 +1237,7 @@
     </w:p>
     <w:p>
       <w:pPr>
+        <w:jc w:val="both"/>
         <w:rPr>
           <w:rFonts w:asciiTheme="majorHAnsi" w:hAnsiTheme="majorHAnsi" w:cstheme="majorHAnsi"/>
           <w:sz w:val="26"/>
@@ -1206,6 +1255,7 @@
     </w:p>
     <w:p>
       <w:pPr>
+        <w:jc w:val="both"/>
         <w:rPr>
           <w:rFonts w:asciiTheme="majorHAnsi" w:hAnsiTheme="majorHAnsi" w:cstheme="majorHAnsi"/>
           <w:sz w:val="26"/>
@@ -1223,6 +1273,7 @@
     </w:p>
     <w:p>
       <w:pPr>
+        <w:jc w:val="both"/>
         <w:rPr>
           <w:rFonts w:asciiTheme="majorHAnsi" w:hAnsiTheme="majorHAnsi" w:cstheme="majorHAnsi"/>
           <w:b/>
@@ -1244,6 +1295,7 @@
     </w:p>
     <w:p>
       <w:pPr>
+        <w:jc w:val="both"/>
         <w:rPr>
           <w:rFonts w:asciiTheme="majorHAnsi" w:hAnsiTheme="majorHAnsi" w:cstheme="majorHAnsi"/>
           <w:sz w:val="26"/>
@@ -1261,6 +1313,7 @@
     </w:p>
     <w:p>
       <w:pPr>
+        <w:jc w:val="both"/>
         <w:rPr>
           <w:rFonts w:asciiTheme="majorHAnsi" w:hAnsiTheme="majorHAnsi" w:cstheme="majorHAnsi"/>
           <w:sz w:val="26"/>
@@ -1278,6 +1331,7 @@
     </w:p>
     <w:p>
       <w:pPr>
+        <w:jc w:val="both"/>
         <w:rPr>
           <w:rFonts w:asciiTheme="majorHAnsi" w:hAnsiTheme="majorHAnsi" w:cstheme="majorHAnsi"/>
           <w:sz w:val="26"/>
@@ -1295,6 +1349,7 @@
     </w:p>
     <w:p>
       <w:pPr>
+        <w:jc w:val="both"/>
         <w:rPr>
           <w:rFonts w:asciiTheme="majorHAnsi" w:hAnsiTheme="majorHAnsi" w:cstheme="majorHAnsi"/>
           <w:sz w:val="26"/>
@@ -1312,6 +1367,7 @@
     </w:p>
     <w:p>
       <w:pPr>
+        <w:jc w:val="both"/>
         <w:rPr>
           <w:rFonts w:asciiTheme="majorHAnsi" w:hAnsiTheme="majorHAnsi" w:cstheme="majorHAnsi"/>
           <w:b/>
@@ -1334,6 +1390,7 @@
     </w:p>
     <w:p>
       <w:pPr>
+        <w:jc w:val="both"/>
         <w:rPr>
           <w:rFonts w:asciiTheme="majorHAnsi" w:hAnsiTheme="majorHAnsi" w:cstheme="majorHAnsi"/>
           <w:sz w:val="26"/>
@@ -1351,6 +1408,7 @@
     </w:p>
     <w:p>
       <w:pPr>
+        <w:jc w:val="both"/>
         <w:rPr>
           <w:rFonts w:asciiTheme="majorHAnsi" w:hAnsiTheme="majorHAnsi" w:cstheme="majorHAnsi"/>
           <w:sz w:val="26"/>
@@ -1368,6 +1426,7 @@
     </w:p>
     <w:p>
       <w:pPr>
+        <w:jc w:val="both"/>
         <w:rPr>
           <w:rFonts w:asciiTheme="majorHAnsi" w:hAnsiTheme="majorHAnsi" w:cstheme="majorHAnsi"/>
           <w:sz w:val="26"/>
@@ -1385,6 +1444,7 @@
     </w:p>
     <w:p>
       <w:pPr>
+        <w:jc w:val="both"/>
         <w:rPr>
           <w:rFonts w:asciiTheme="majorHAnsi" w:hAnsiTheme="majorHAnsi" w:cstheme="majorHAnsi"/>
           <w:sz w:val="26"/>
@@ -1402,6 +1462,7 @@
     </w:p>
     <w:p>
       <w:pPr>
+        <w:jc w:val="both"/>
         <w:rPr>
           <w:rFonts w:asciiTheme="majorHAnsi" w:hAnsiTheme="majorHAnsi" w:cstheme="majorHAnsi"/>
           <w:sz w:val="26"/>
@@ -1419,6 +1480,7 @@
     </w:p>
     <w:p>
       <w:pPr>
+        <w:jc w:val="both"/>
         <w:rPr>
           <w:rFonts w:asciiTheme="majorHAnsi" w:hAnsiTheme="majorHAnsi" w:cstheme="majorHAnsi"/>
           <w:sz w:val="26"/>
@@ -1436,6 +1498,7 @@
     </w:p>
     <w:p>
       <w:pPr>
+        <w:jc w:val="both"/>
         <w:rPr>
           <w:rFonts w:asciiTheme="majorHAnsi" w:hAnsiTheme="majorHAnsi" w:cstheme="majorHAnsi"/>
           <w:b/>
@@ -1457,6 +1520,7 @@
     </w:p>
     <w:p>
       <w:pPr>
+        <w:jc w:val="both"/>
         <w:rPr>
           <w:rFonts w:asciiTheme="majorHAnsi" w:hAnsiTheme="majorHAnsi" w:cstheme="majorHAnsi"/>
           <w:b/>
@@ -1478,27 +1542,890 @@
     </w:p>
     <w:p>
       <w:pPr>
-        <w:rPr>
-          <w:rFonts w:asciiTheme="majorHAnsi" w:hAnsiTheme="majorHAnsi" w:cstheme="majorHAnsi"/>
-          <w:b/>
-          <w:bCs/>
-          <w:sz w:val="26"/>
-          <w:szCs w:val="26"/>
-        </w:rPr>
-      </w:pPr>
-      <w:r>
-        <w:rPr>
-          <w:rFonts w:asciiTheme="majorHAnsi" w:hAnsiTheme="majorHAnsi" w:cstheme="majorHAnsi"/>
-          <w:b/>
-          <w:bCs/>
-          <w:sz w:val="26"/>
-          <w:szCs w:val="26"/>
+        <w:jc w:val="both"/>
+        <w:rPr>
+          <w:rFonts w:asciiTheme="majorHAnsi" w:hAnsiTheme="majorHAnsi" w:cstheme="majorHAnsi"/>
+          <w:b/>
+          <w:bCs/>
+          <w:sz w:val="26"/>
+          <w:szCs w:val="26"/>
+        </w:rPr>
+      </w:pPr>
+      <w:r>
+        <w:rPr>
+          <w:rFonts w:asciiTheme="majorHAnsi" w:hAnsiTheme="majorHAnsi" w:cstheme="majorHAnsi"/>
+          <w:b/>
+          <w:bCs/>
+          <w:sz w:val="26"/>
+          <w:szCs w:val="26"/>
+        </w:rPr>
+        <w:t>Thực hiện Stress Test</w:t>
+      </w:r>
+    </w:p>
+    <w:p>
+      <w:pPr>
+        <w:jc w:val="both"/>
+        <w:rPr>
+          <w:rFonts w:asciiTheme="majorHAnsi" w:hAnsiTheme="majorHAnsi" w:cstheme="majorHAnsi"/>
+          <w:sz w:val="26"/>
+          <w:szCs w:val="26"/>
+        </w:rPr>
+      </w:pPr>
+      <w:r>
+        <w:rPr>
+          <w:rFonts w:asciiTheme="majorHAnsi" w:hAnsiTheme="majorHAnsi" w:cstheme="majorHAnsi"/>
+          <w:sz w:val="26"/>
+          <w:szCs w:val="26"/>
+        </w:rPr>
+        <w:t>Các nhãn văn bản ngắn ban đầu được thay thế bằng các chuỗi văn bản dài hơn. Đồng thời, kích thước chữ được tăng lên để mô phỏng trường hợp người dùng sử dụng kích thước chữ lớn.</w:t>
+      </w:r>
+    </w:p>
+    <w:p>
+      <w:pPr>
+        <w:pStyle w:val="ListParagraph"/>
+        <w:numPr>
+          <w:ilvl w:val="0"/>
+          <w:numId w:val="2"/>
+        </w:numPr>
+        <w:jc w:val="both"/>
+        <w:rPr>
+          <w:rFonts w:asciiTheme="majorHAnsi" w:hAnsiTheme="majorHAnsi" w:cstheme="majorHAnsi"/>
+          <w:sz w:val="26"/>
+          <w:szCs w:val="26"/>
+        </w:rPr>
+      </w:pPr>
+      <w:r>
+        <w:rPr>
+          <w:rFonts w:asciiTheme="majorHAnsi" w:hAnsiTheme="majorHAnsi" w:cstheme="majorHAnsi"/>
+          <w:sz w:val="26"/>
+          <w:szCs w:val="26"/>
+        </w:rPr>
+        <w:t>Mã SV</w:t>
+      </w:r>
+      <w:r>
+        <w:rPr>
+          <w:rFonts w:asciiTheme="majorHAnsi" w:hAnsiTheme="majorHAnsi" w:cstheme="majorHAnsi"/>
+          <w:sz w:val="26"/>
+          <w:szCs w:val="26"/>
+        </w:rPr>
+        <w:t xml:space="preserve"> </w:t>
+      </w:r>
+      <w:r>
+        <w:rPr>
+          <w:rFonts w:asciiTheme="majorHAnsi" w:hAnsiTheme="majorHAnsi" w:cstheme="majorHAnsi"/>
+          <w:sz w:val="26"/>
+          <w:szCs w:val="26"/>
+        </w:rPr>
+        <w:sym w:font="Wingdings" w:char="F0E0"/>
+      </w:r>
+      <w:r>
+        <w:rPr>
+          <w:rFonts w:asciiTheme="majorHAnsi" w:hAnsiTheme="majorHAnsi" w:cstheme="majorHAnsi"/>
+          <w:sz w:val="26"/>
+          <w:szCs w:val="26"/>
+        </w:rPr>
+        <w:t xml:space="preserve"> Mã số sinh viên</w:t>
+      </w:r>
+    </w:p>
+    <w:p>
+      <w:pPr>
+        <w:pStyle w:val="ListParagraph"/>
+        <w:numPr>
+          <w:ilvl w:val="0"/>
+          <w:numId w:val="2"/>
+        </w:numPr>
+        <w:jc w:val="both"/>
+        <w:rPr>
+          <w:rFonts w:asciiTheme="majorHAnsi" w:hAnsiTheme="majorHAnsi" w:cstheme="majorHAnsi"/>
+          <w:sz w:val="26"/>
+          <w:szCs w:val="26"/>
+        </w:rPr>
+      </w:pPr>
+      <w:r>
+        <w:rPr>
+          <w:rFonts w:asciiTheme="majorHAnsi" w:hAnsiTheme="majorHAnsi" w:cstheme="majorHAnsi"/>
+          <w:sz w:val="26"/>
+          <w:szCs w:val="26"/>
+        </w:rPr>
+        <w:t>Ngành học</w:t>
+      </w:r>
+      <w:r>
+        <w:rPr>
+          <w:rFonts w:asciiTheme="majorHAnsi" w:hAnsiTheme="majorHAnsi" w:cstheme="majorHAnsi"/>
+          <w:sz w:val="26"/>
+          <w:szCs w:val="26"/>
+        </w:rPr>
+        <w:t xml:space="preserve"> </w:t>
+      </w:r>
+      <w:r>
+        <w:rPr>
+          <w:rFonts w:asciiTheme="majorHAnsi" w:hAnsiTheme="majorHAnsi" w:cstheme="majorHAnsi"/>
+          <w:sz w:val="26"/>
+          <w:szCs w:val="26"/>
+        </w:rPr>
+        <w:sym w:font="Wingdings" w:char="F0E0"/>
+      </w:r>
+      <w:r>
+        <w:rPr>
+          <w:rFonts w:asciiTheme="majorHAnsi" w:hAnsiTheme="majorHAnsi" w:cstheme="majorHAnsi"/>
+          <w:sz w:val="26"/>
+          <w:szCs w:val="26"/>
+        </w:rPr>
+        <w:t xml:space="preserve"> Chương trình đào tạo và ngành học</w:t>
+      </w:r>
+    </w:p>
+    <w:p>
+      <w:pPr>
+        <w:pStyle w:val="ListParagraph"/>
+        <w:numPr>
+          <w:ilvl w:val="0"/>
+          <w:numId w:val="2"/>
+        </w:numPr>
+        <w:jc w:val="both"/>
+        <w:rPr>
+          <w:rFonts w:asciiTheme="majorHAnsi" w:hAnsiTheme="majorHAnsi" w:cstheme="majorHAnsi"/>
+          <w:sz w:val="26"/>
+          <w:szCs w:val="26"/>
+        </w:rPr>
+      </w:pPr>
+      <w:r>
+        <w:rPr>
+          <w:rFonts w:asciiTheme="majorHAnsi" w:hAnsiTheme="majorHAnsi" w:cstheme="majorHAnsi"/>
+          <w:sz w:val="26"/>
+          <w:szCs w:val="26"/>
+        </w:rPr>
+        <w:t>Niên khóa</w:t>
+      </w:r>
+      <w:r>
+        <w:rPr>
+          <w:rFonts w:asciiTheme="majorHAnsi" w:hAnsiTheme="majorHAnsi" w:cstheme="majorHAnsi"/>
+          <w:sz w:val="26"/>
+          <w:szCs w:val="26"/>
+        </w:rPr>
+        <w:t xml:space="preserve"> </w:t>
+      </w:r>
+      <w:r>
+        <w:rPr>
+          <w:rFonts w:asciiTheme="majorHAnsi" w:hAnsiTheme="majorHAnsi" w:cstheme="majorHAnsi"/>
+          <w:sz w:val="26"/>
+          <w:szCs w:val="26"/>
+        </w:rPr>
+        <w:sym w:font="Wingdings" w:char="F0E0"/>
+      </w:r>
+      <w:r>
+        <w:rPr>
+          <w:rFonts w:asciiTheme="majorHAnsi" w:hAnsiTheme="majorHAnsi" w:cstheme="majorHAnsi"/>
+          <w:sz w:val="26"/>
+          <w:szCs w:val="26"/>
+        </w:rPr>
+        <w:t xml:space="preserve"> Niên khóa đào tạo của sinh viên</w:t>
+      </w:r>
+    </w:p>
+    <w:p>
+      <w:pPr>
+        <w:pStyle w:val="ListParagraph"/>
+        <w:numPr>
+          <w:ilvl w:val="0"/>
+          <w:numId w:val="2"/>
+        </w:numPr>
+        <w:jc w:val="both"/>
+        <w:rPr>
+          <w:rFonts w:asciiTheme="majorHAnsi" w:hAnsiTheme="majorHAnsi" w:cstheme="majorHAnsi"/>
+          <w:sz w:val="26"/>
+          <w:szCs w:val="26"/>
+        </w:rPr>
+      </w:pPr>
+      <w:r>
+        <w:rPr>
+          <w:rFonts w:asciiTheme="majorHAnsi" w:hAnsiTheme="majorHAnsi" w:cstheme="majorHAnsi"/>
+          <w:sz w:val="26"/>
+          <w:szCs w:val="26"/>
+        </w:rPr>
+        <w:t xml:space="preserve">KHÓA HỌC </w:t>
+      </w:r>
+      <w:r>
+        <w:rPr>
+          <w:rFonts w:asciiTheme="majorHAnsi" w:hAnsiTheme="majorHAnsi" w:cstheme="majorHAnsi"/>
+          <w:sz w:val="26"/>
+          <w:szCs w:val="26"/>
+        </w:rPr>
+        <w:sym w:font="Wingdings" w:char="F0E0"/>
+      </w:r>
+      <w:r>
+        <w:rPr>
+          <w:rFonts w:asciiTheme="majorHAnsi" w:hAnsiTheme="majorHAnsi" w:cstheme="majorHAnsi"/>
+          <w:sz w:val="26"/>
+          <w:szCs w:val="26"/>
+        </w:rPr>
+        <w:t xml:space="preserve"> DANH SÁCH CÁC KHÓA HỌC VÀ MÔN HỌC ĐANG ĐƯỢC ĐĂNG KÝ</w:t>
+      </w:r>
+    </w:p>
+    <w:p>
+      <w:pPr>
+        <w:pStyle w:val="ListParagraph"/>
+        <w:numPr>
+          <w:ilvl w:val="0"/>
+          <w:numId w:val="2"/>
+        </w:numPr>
+        <w:jc w:val="both"/>
+        <w:rPr>
+          <w:rFonts w:asciiTheme="majorHAnsi" w:hAnsiTheme="majorHAnsi" w:cstheme="majorHAnsi"/>
+          <w:sz w:val="26"/>
+          <w:szCs w:val="26"/>
+        </w:rPr>
+      </w:pPr>
+      <w:r>
+        <w:rPr>
+          <w:rFonts w:asciiTheme="majorHAnsi" w:hAnsiTheme="majorHAnsi" w:cstheme="majorHAnsi"/>
+          <w:sz w:val="26"/>
+          <w:szCs w:val="26"/>
+        </w:rPr>
+        <w:t xml:space="preserve">THÔNG BÁO </w:t>
+      </w:r>
+      <w:r>
+        <w:rPr>
+          <w:rFonts w:asciiTheme="majorHAnsi" w:hAnsiTheme="majorHAnsi" w:cstheme="majorHAnsi"/>
+          <w:sz w:val="26"/>
+          <w:szCs w:val="26"/>
+        </w:rPr>
+        <w:t xml:space="preserve"> </w:t>
+      </w:r>
+      <w:r>
+        <w:rPr>
+          <w:rFonts w:asciiTheme="majorHAnsi" w:hAnsiTheme="majorHAnsi" w:cstheme="majorHAnsi"/>
+          <w:sz w:val="26"/>
+          <w:szCs w:val="26"/>
+        </w:rPr>
+        <w:sym w:font="Wingdings" w:char="F0E0"/>
+      </w:r>
+      <w:r>
+        <w:rPr>
+          <w:rFonts w:asciiTheme="majorHAnsi" w:hAnsiTheme="majorHAnsi" w:cstheme="majorHAnsi"/>
+          <w:sz w:val="26"/>
+          <w:szCs w:val="26"/>
+        </w:rPr>
+        <w:t xml:space="preserve"> CÁC THÔNG BÁO QUAN TRỌNG DÀNH CHO SINH VIÊ</w:t>
+      </w:r>
+      <w:r>
+        <w:rPr>
+          <w:rFonts w:asciiTheme="majorHAnsi" w:hAnsiTheme="majorHAnsi" w:cstheme="majorHAnsi"/>
+          <w:sz w:val="26"/>
+          <w:szCs w:val="26"/>
+        </w:rPr>
+        <w:t>N</w:t>
+      </w:r>
+    </w:p>
+    <w:p>
+      <w:pPr>
+        <w:jc w:val="center"/>
+        <w:rPr>
+          <w:rStyle w:val="SubtleEmphasis"/>
+          <w:rFonts w:asciiTheme="majorHAnsi" w:hAnsiTheme="majorHAnsi" w:cstheme="majorHAnsi"/>
+        </w:rPr>
+      </w:pPr>
+      <w:r>
+        <w:rPr>
+          <w:rFonts w:asciiTheme="majorHAnsi" w:hAnsiTheme="majorHAnsi" w:cstheme="majorHAnsi"/>
+          <w:b/>
+          <w:bCs/>
+          <w:sz w:val="26"/>
+          <w:szCs w:val="26"/>
+        </w:rPr>
+        <w:lastRenderedPageBreak/>
+        <w:drawing>
+          <wp:inline distT="0" distB="0" distL="0" distR="0" wp14:anchorId="2F74DCD5" wp14:editId="1066747A">
+            <wp:extent cx="5731510" cy="3582035"/>
+            <wp:effectExtent l="0" t="0" r="2540" b="0"/>
+            <wp:docPr id="824959979" name="Picture 1"/>
+            <wp:cNvGraphicFramePr>
+              <a:graphicFrameLocks xmlns:a="http://schemas.openxmlformats.org/drawingml/2006/main" noChangeAspect="1"/>
+            </wp:cNvGraphicFramePr>
+            <a:graphic xmlns:a="http://schemas.openxmlformats.org/drawingml/2006/main">
+              <a:graphicData uri="http://schemas.openxmlformats.org/drawingml/2006/picture">
+                <pic:pic xmlns:pic="http://schemas.openxmlformats.org/drawingml/2006/picture">
+                  <pic:nvPicPr>
+                    <pic:cNvPr id="824959979" name=""/>
+                    <pic:cNvPicPr/>
+                  </pic:nvPicPr>
+                  <pic:blipFill>
+                    <a:blip r:embed="rId7"/>
+                    <a:stretch>
+                      <a:fillRect/>
+                    </a:stretch>
+                  </pic:blipFill>
+                  <pic:spPr>
+                    <a:xfrm>
+                      <a:off x="0" y="0"/>
+                      <a:ext cx="5731510" cy="3582035"/>
+                    </a:xfrm>
+                    <a:prstGeom prst="rect">
+                      <a:avLst/>
+                    </a:prstGeom>
+                  </pic:spPr>
+                </pic:pic>
+              </a:graphicData>
+            </a:graphic>
+          </wp:inline>
+        </w:drawing>
+      </w:r>
+      <w:r>
+        <w:rPr>
+          <w:rFonts w:asciiTheme="majorHAnsi" w:hAnsiTheme="majorHAnsi" w:cstheme="majorHAnsi"/>
+          <w:b/>
+          <w:bCs/>
+          <w:sz w:val="26"/>
+          <w:szCs w:val="26"/>
+        </w:rPr>
+        <w:br/>
+      </w:r>
+      <w:r>
+        <w:rPr>
+          <w:rStyle w:val="SubtleEmphasis"/>
+          <w:rFonts w:asciiTheme="majorHAnsi" w:hAnsiTheme="majorHAnsi" w:cstheme="majorHAnsi"/>
+        </w:rPr>
+        <w:t>Hình 2</w:t>
+      </w:r>
+      <w:r>
+        <w:rPr>
+          <w:rStyle w:val="SubtleEmphasis"/>
+          <w:rFonts w:asciiTheme="majorHAnsi" w:hAnsiTheme="majorHAnsi" w:cstheme="majorHAnsi"/>
+        </w:rPr>
+        <w:t>.1</w:t>
+      </w:r>
+      <w:r>
+        <w:rPr>
+          <w:rStyle w:val="SubtleEmphasis"/>
+          <w:rFonts w:asciiTheme="majorHAnsi" w:hAnsiTheme="majorHAnsi" w:cstheme="majorHAnsi"/>
+        </w:rPr>
+        <w:t>. Kết quả stress test trước khi sửa layout</w:t>
+      </w:r>
+    </w:p>
+    <w:p>
+      <w:pPr>
+        <w:jc w:val="both"/>
+        <w:rPr>
+          <w:rFonts w:asciiTheme="majorHAnsi" w:hAnsiTheme="majorHAnsi" w:cstheme="majorHAnsi"/>
+          <w:b/>
+          <w:bCs/>
+          <w:sz w:val="26"/>
+          <w:szCs w:val="26"/>
+        </w:rPr>
+      </w:pPr>
+      <w:r>
+        <w:rPr>
+          <w:rFonts w:asciiTheme="majorHAnsi" w:hAnsiTheme="majorHAnsi" w:cstheme="majorHAnsi"/>
+          <w:b/>
+          <w:bCs/>
+          <w:sz w:val="26"/>
+          <w:szCs w:val="26"/>
+        </w:rPr>
+        <w:t>Kết quả Stress Test</w:t>
+      </w:r>
+    </w:p>
+    <w:p>
+      <w:pPr>
+        <w:jc w:val="both"/>
+        <w:rPr>
+          <w:rFonts w:asciiTheme="majorHAnsi" w:hAnsiTheme="majorHAnsi" w:cstheme="majorHAnsi"/>
+          <w:sz w:val="26"/>
+          <w:szCs w:val="26"/>
+        </w:rPr>
+      </w:pPr>
+      <w:r>
+        <w:rPr>
+          <w:rFonts w:asciiTheme="majorHAnsi" w:hAnsiTheme="majorHAnsi" w:cstheme="majorHAnsi"/>
+          <w:sz w:val="26"/>
+          <w:szCs w:val="26"/>
+        </w:rPr>
+        <w:t>Sau khi thay thế các nhãn ngắn bằng các chuỗi văn bản dài hơn và tăng kích thước chữ lên 22px, giao diện xuất hiện hiện tượng văn bản xuống dòng nhiều lần trong khu vực label.</w:t>
+      </w:r>
+    </w:p>
+    <w:p>
+      <w:pPr>
+        <w:jc w:val="both"/>
+        <w:rPr>
+          <w:rFonts w:asciiTheme="majorHAnsi" w:hAnsiTheme="majorHAnsi" w:cstheme="majorHAnsi"/>
+          <w:sz w:val="26"/>
+          <w:szCs w:val="26"/>
+        </w:rPr>
+      </w:pPr>
+      <w:r>
+        <w:rPr>
+          <w:rFonts w:asciiTheme="majorHAnsi" w:hAnsiTheme="majorHAnsi" w:cstheme="majorHAnsi"/>
+          <w:sz w:val="26"/>
+          <w:szCs w:val="26"/>
+        </w:rPr>
+        <w:t>Ví dụ, nhãn:</w:t>
+      </w:r>
+      <w:r>
+        <w:rPr>
+          <w:rFonts w:asciiTheme="majorHAnsi" w:hAnsiTheme="majorHAnsi" w:cstheme="majorHAnsi"/>
+          <w:sz w:val="26"/>
+          <w:szCs w:val="26"/>
+        </w:rPr>
+        <w:t xml:space="preserve"> </w:t>
+      </w:r>
+      <w:r>
+        <w:rPr>
+          <w:rFonts w:asciiTheme="majorHAnsi" w:hAnsiTheme="majorHAnsi" w:cstheme="majorHAnsi"/>
+          <w:sz w:val="26"/>
+          <w:szCs w:val="26"/>
+        </w:rPr>
+        <w:t>"Chương trình đào tạo và ngành học:"</w:t>
+      </w:r>
+      <w:r>
+        <w:rPr>
+          <w:rFonts w:asciiTheme="majorHAnsi" w:hAnsiTheme="majorHAnsi" w:cstheme="majorHAnsi"/>
+          <w:sz w:val="26"/>
+          <w:szCs w:val="26"/>
+        </w:rPr>
+        <w:t xml:space="preserve"> </w:t>
+      </w:r>
+      <w:r>
+        <w:rPr>
+          <w:rFonts w:asciiTheme="majorHAnsi" w:hAnsiTheme="majorHAnsi" w:cstheme="majorHAnsi"/>
+          <w:sz w:val="26"/>
+          <w:szCs w:val="26"/>
+        </w:rPr>
+        <w:t>bị chia thành nhiều dòng do component InfoRow đang giới hạn chiều rộng của label ở mức 100px.</w:t>
+      </w:r>
+    </w:p>
+    <w:p>
+      <w:pPr>
+        <w:jc w:val="both"/>
+        <w:rPr>
+          <w:rFonts w:asciiTheme="majorHAnsi" w:hAnsiTheme="majorHAnsi" w:cstheme="majorHAnsi"/>
+          <w:sz w:val="26"/>
+          <w:szCs w:val="26"/>
+        </w:rPr>
+      </w:pPr>
+      <w:r>
+        <w:rPr>
+          <w:rFonts w:asciiTheme="majorHAnsi" w:hAnsiTheme="majorHAnsi" w:cstheme="majorHAnsi"/>
+          <w:sz w:val="26"/>
+          <w:szCs w:val="26"/>
+        </w:rPr>
+        <w:t>Tương tự, nhãn:</w:t>
+      </w:r>
+      <w:r>
+        <w:rPr>
+          <w:rFonts w:asciiTheme="majorHAnsi" w:hAnsiTheme="majorHAnsi" w:cstheme="majorHAnsi"/>
+          <w:sz w:val="26"/>
+          <w:szCs w:val="26"/>
+        </w:rPr>
+        <w:t xml:space="preserve"> </w:t>
+      </w:r>
+      <w:r>
+        <w:rPr>
+          <w:rFonts w:asciiTheme="majorHAnsi" w:hAnsiTheme="majorHAnsi" w:cstheme="majorHAnsi"/>
+          <w:sz w:val="26"/>
+          <w:szCs w:val="26"/>
+        </w:rPr>
+        <w:t>"Niên khóa đào tạo của sinh viên:"</w:t>
+      </w:r>
+      <w:r>
+        <w:rPr>
+          <w:rFonts w:asciiTheme="majorHAnsi" w:hAnsiTheme="majorHAnsi" w:cstheme="majorHAnsi"/>
+          <w:sz w:val="26"/>
+          <w:szCs w:val="26"/>
+        </w:rPr>
+        <w:t xml:space="preserve"> </w:t>
+      </w:r>
+      <w:r>
+        <w:rPr>
+          <w:rFonts w:asciiTheme="majorHAnsi" w:hAnsiTheme="majorHAnsi" w:cstheme="majorHAnsi"/>
+          <w:sz w:val="26"/>
+          <w:szCs w:val="26"/>
+        </w:rPr>
+        <w:t>cũng bị chia thành nhiều dòng.</w:t>
+      </w:r>
+    </w:p>
+    <w:p>
+      <w:pPr>
+        <w:jc w:val="both"/>
+        <w:rPr>
+          <w:rFonts w:asciiTheme="majorHAnsi" w:hAnsiTheme="majorHAnsi" w:cstheme="majorHAnsi"/>
+          <w:sz w:val="26"/>
+          <w:szCs w:val="26"/>
+        </w:rPr>
+      </w:pPr>
+      <w:r>
+        <w:rPr>
+          <w:rFonts w:asciiTheme="majorHAnsi" w:hAnsiTheme="majorHAnsi" w:cstheme="majorHAnsi"/>
+          <w:sz w:val="26"/>
+          <w:szCs w:val="26"/>
+        </w:rPr>
+        <w:lastRenderedPageBreak/>
+        <w:drawing>
+          <wp:inline distT="0" distB="0" distL="0" distR="0" wp14:anchorId="23E58AF4" wp14:editId="3A0118AD">
+            <wp:extent cx="5731510" cy="3582035"/>
+            <wp:effectExtent l="0" t="0" r="2540" b="0"/>
+            <wp:docPr id="1874251178" name="Picture 1"/>
+            <wp:cNvGraphicFramePr>
+              <a:graphicFrameLocks xmlns:a="http://schemas.openxmlformats.org/drawingml/2006/main" noChangeAspect="1"/>
+            </wp:cNvGraphicFramePr>
+            <a:graphic xmlns:a="http://schemas.openxmlformats.org/drawingml/2006/main">
+              <a:graphicData uri="http://schemas.openxmlformats.org/drawingml/2006/picture">
+                <pic:pic xmlns:pic="http://schemas.openxmlformats.org/drawingml/2006/picture">
+                  <pic:nvPicPr>
+                    <pic:cNvPr id="1874251178" name=""/>
+                    <pic:cNvPicPr/>
+                  </pic:nvPicPr>
+                  <pic:blipFill>
+                    <a:blip r:embed="rId8"/>
+                    <a:stretch>
+                      <a:fillRect/>
+                    </a:stretch>
+                  </pic:blipFill>
+                  <pic:spPr>
+                    <a:xfrm>
+                      <a:off x="0" y="0"/>
+                      <a:ext cx="5731510" cy="3582035"/>
+                    </a:xfrm>
+                    <a:prstGeom prst="rect">
+                      <a:avLst/>
+                    </a:prstGeom>
+                  </pic:spPr>
+                </pic:pic>
+              </a:graphicData>
+            </a:graphic>
+          </wp:inline>
+        </w:drawing>
+      </w:r>
+    </w:p>
+    <w:p>
+      <w:pPr>
+        <w:jc w:val="center"/>
+        <w:rPr>
+          <w:rStyle w:val="SubtleEmphasis"/>
+          <w:rFonts w:asciiTheme="majorHAnsi" w:hAnsiTheme="majorHAnsi" w:cstheme="majorHAnsi"/>
+        </w:rPr>
+      </w:pPr>
+      <w:r>
+        <w:rPr>
+          <w:rStyle w:val="SubtleEmphasis"/>
+          <w:rFonts w:asciiTheme="majorHAnsi" w:hAnsiTheme="majorHAnsi" w:cstheme="majorHAnsi"/>
+        </w:rPr>
+        <w:t>Hình 2.2. layout khi áp dụng flex 0.45 và 0.55</w:t>
+      </w:r>
+    </w:p>
+    <w:p>
+      <w:pPr>
+        <w:jc w:val="both"/>
+        <w:rPr>
+          <w:rFonts w:asciiTheme="majorHAnsi" w:hAnsiTheme="majorHAnsi" w:cstheme="majorHAnsi"/>
+          <w:sz w:val="26"/>
+          <w:szCs w:val="26"/>
+        </w:rPr>
+      </w:pPr>
+      <w:r>
+        <w:rPr>
+          <w:rFonts w:asciiTheme="majorHAnsi" w:hAnsiTheme="majorHAnsi" w:cstheme="majorHAnsi"/>
+          <w:sz w:val="26"/>
+          <w:szCs w:val="26"/>
+        </w:rPr>
+        <w:t>Cách tiếp cận này giúp layout linh hoạt hơn khi nội dung thay đổi hoặc kích thước màn hình khác nhau.</w:t>
+      </w:r>
+    </w:p>
+    <w:p>
+      <w:pPr>
+        <w:jc w:val="both"/>
+        <w:rPr>
+          <w:rFonts w:asciiTheme="majorHAnsi" w:hAnsiTheme="majorHAnsi" w:cstheme="majorHAnsi"/>
+          <w:b/>
+          <w:bCs/>
+          <w:sz w:val="26"/>
+          <w:szCs w:val="26"/>
+        </w:rPr>
+      </w:pPr>
+      <w:r>
+        <w:rPr>
+          <w:rFonts w:asciiTheme="majorHAnsi" w:hAnsiTheme="majorHAnsi" w:cstheme="majorHAnsi"/>
+          <w:b/>
+          <w:bCs/>
+          <w:sz w:val="26"/>
+          <w:szCs w:val="26"/>
+        </w:rPr>
+        <w:t>Kết quả sau khi sửa</w:t>
+      </w:r>
+      <w:r>
+        <w:rPr>
+          <w:rFonts w:asciiTheme="majorHAnsi" w:hAnsiTheme="majorHAnsi" w:cstheme="majorHAnsi"/>
+          <w:b/>
+          <w:bCs/>
+          <w:sz w:val="26"/>
+          <w:szCs w:val="26"/>
+        </w:rPr>
+        <w:t>:</w:t>
+      </w:r>
+    </w:p>
+    <w:p>
+      <w:pPr>
+        <w:jc w:val="both"/>
+        <w:rPr>
+          <w:rFonts w:asciiTheme="majorHAnsi" w:hAnsiTheme="majorHAnsi" w:cstheme="majorHAnsi"/>
+          <w:sz w:val="26"/>
+          <w:szCs w:val="26"/>
+        </w:rPr>
+      </w:pPr>
+      <w:r>
+        <w:rPr>
+          <w:rFonts w:asciiTheme="majorHAnsi" w:hAnsiTheme="majorHAnsi" w:cstheme="majorHAnsi"/>
+          <w:sz w:val="26"/>
+          <w:szCs w:val="26"/>
+        </w:rPr>
+        <w:t>Sau khi thay đổi layout, các văn bản dài được wrap tự nhiên hơn. Label và value được phân bổ không gian bằng Flexbox, giúp giảm tình trạng label bị chia thành quá nhiều dòng.</w:t>
+      </w:r>
+    </w:p>
+    <w:p>
+      <w:pPr>
+        <w:jc w:val="both"/>
+        <w:rPr>
+          <w:rFonts w:asciiTheme="majorHAnsi" w:hAnsiTheme="majorHAnsi" w:cstheme="majorHAnsi"/>
+          <w:sz w:val="26"/>
+          <w:szCs w:val="26"/>
+        </w:rPr>
+      </w:pPr>
+      <w:r>
+        <w:rPr>
+          <w:rFonts w:asciiTheme="majorHAnsi" w:hAnsiTheme="majorHAnsi" w:cstheme="majorHAnsi"/>
+          <w:sz w:val="26"/>
+          <w:szCs w:val="26"/>
+        </w:rPr>
+        <w:t>Ngoài ra, ScrollView cho phép người dùng cuộn qua toàn bộ Campus Dashboard khi tổng nội dung vượt quá chiều cao màn hình.</w:t>
+      </w:r>
+    </w:p>
+    <w:p>
+      <w:pPr>
+        <w:jc w:val="both"/>
+        <w:rPr>
+          <w:rFonts w:asciiTheme="majorHAnsi" w:hAnsiTheme="majorHAnsi" w:cstheme="majorHAnsi"/>
+          <w:sz w:val="26"/>
+          <w:szCs w:val="26"/>
+        </w:rPr>
+      </w:pPr>
+      <w:r>
+        <w:rPr>
+          <w:rFonts w:asciiTheme="majorHAnsi" w:hAnsiTheme="majorHAnsi" w:cstheme="majorHAnsi"/>
+          <w:sz w:val="26"/>
+          <w:szCs w:val="26"/>
+        </w:rPr>
+        <w:lastRenderedPageBreak/>
+        <w:drawing>
+          <wp:inline distT="0" distB="0" distL="0" distR="0" wp14:anchorId="1578587A" wp14:editId="0394EAEE">
+            <wp:extent cx="5731510" cy="3582035"/>
+            <wp:effectExtent l="0" t="0" r="2540" b="0"/>
+            <wp:docPr id="1120052542" name="Picture 1"/>
+            <wp:cNvGraphicFramePr>
+              <a:graphicFrameLocks xmlns:a="http://schemas.openxmlformats.org/drawingml/2006/main" noChangeAspect="1"/>
+            </wp:cNvGraphicFramePr>
+            <a:graphic xmlns:a="http://schemas.openxmlformats.org/drawingml/2006/main">
+              <a:graphicData uri="http://schemas.openxmlformats.org/drawingml/2006/picture">
+                <pic:pic xmlns:pic="http://schemas.openxmlformats.org/drawingml/2006/picture">
+                  <pic:nvPicPr>
+                    <pic:cNvPr id="1120052542" name=""/>
+                    <pic:cNvPicPr/>
+                  </pic:nvPicPr>
+                  <pic:blipFill>
+                    <a:blip r:embed="rId9"/>
+                    <a:stretch>
+                      <a:fillRect/>
+                    </a:stretch>
+                  </pic:blipFill>
+                  <pic:spPr>
+                    <a:xfrm>
+                      <a:off x="0" y="0"/>
+                      <a:ext cx="5731510" cy="3582035"/>
+                    </a:xfrm>
+                    <a:prstGeom prst="rect">
+                      <a:avLst/>
+                    </a:prstGeom>
+                  </pic:spPr>
+                </pic:pic>
+              </a:graphicData>
+            </a:graphic>
+          </wp:inline>
+        </w:drawing>
+      </w:r>
+    </w:p>
+    <w:p>
+      <w:pPr>
+        <w:jc w:val="center"/>
+        <w:rPr>
+          <w:rFonts w:asciiTheme="majorHAnsi" w:hAnsiTheme="majorHAnsi" w:cstheme="majorHAnsi"/>
+          <w:i/>
+          <w:iCs/>
+          <w:color w:val="404040" w:themeColor="text1" w:themeTint="BF"/>
+        </w:rPr>
+      </w:pPr>
+      <w:r>
+        <w:rPr>
+          <w:rStyle w:val="SubtleEmphasis"/>
+          <w:rFonts w:asciiTheme="majorHAnsi" w:hAnsiTheme="majorHAnsi" w:cstheme="majorHAnsi"/>
+        </w:rPr>
+        <w:t>Hình 2.</w:t>
+      </w:r>
+      <w:r>
+        <w:rPr>
+          <w:rStyle w:val="SubtleEmphasis"/>
+          <w:rFonts w:asciiTheme="majorHAnsi" w:hAnsiTheme="majorHAnsi" w:cstheme="majorHAnsi"/>
+        </w:rPr>
+        <w:t>3</w:t>
+      </w:r>
+      <w:r>
+        <w:rPr>
+          <w:rStyle w:val="SubtleEmphasis"/>
+          <w:rFonts w:asciiTheme="majorHAnsi" w:hAnsiTheme="majorHAnsi" w:cstheme="majorHAnsi"/>
+        </w:rPr>
+        <w:t xml:space="preserve">. layout khi áp dụng </w:t>
+      </w:r>
+      <w:r>
+        <w:rPr>
+          <w:rStyle w:val="SubtleEmphasis"/>
+          <w:rFonts w:asciiTheme="majorHAnsi" w:hAnsiTheme="majorHAnsi" w:cstheme="majorHAnsi"/>
+        </w:rPr>
+        <w:t>scroll</w:t>
+      </w:r>
+      <w:r>
+        <w:rPr>
+          <w:rStyle w:val="SubtleEmphasis"/>
+          <w:rFonts w:asciiTheme="majorHAnsi" w:hAnsiTheme="majorHAnsi" w:cstheme="majorHAnsi"/>
+        </w:rPr>
+        <w:t xml:space="preserve"> (1)</w:t>
+      </w:r>
+    </w:p>
+    <w:p>
+      <w:pPr>
+        <w:jc w:val="both"/>
+        <w:rPr>
+          <w:rFonts w:asciiTheme="majorHAnsi" w:hAnsiTheme="majorHAnsi" w:cstheme="majorHAnsi"/>
+          <w:sz w:val="26"/>
+          <w:szCs w:val="26"/>
+        </w:rPr>
+      </w:pPr>
+      <w:r>
+        <w:rPr>
+          <w:rFonts w:asciiTheme="majorHAnsi" w:hAnsiTheme="majorHAnsi" w:cstheme="majorHAnsi"/>
+          <w:sz w:val="26"/>
+          <w:szCs w:val="26"/>
+        </w:rPr>
+        <w:drawing>
+          <wp:inline distT="0" distB="0" distL="0" distR="0" wp14:anchorId="00E86599" wp14:editId="45946D93">
+            <wp:extent cx="5731510" cy="3582035"/>
+            <wp:effectExtent l="0" t="0" r="2540" b="0"/>
+            <wp:docPr id="183215646" name="Picture 1"/>
+            <wp:cNvGraphicFramePr>
+              <a:graphicFrameLocks xmlns:a="http://schemas.openxmlformats.org/drawingml/2006/main" noChangeAspect="1"/>
+            </wp:cNvGraphicFramePr>
+            <a:graphic xmlns:a="http://schemas.openxmlformats.org/drawingml/2006/main">
+              <a:graphicData uri="http://schemas.openxmlformats.org/drawingml/2006/picture">
+                <pic:pic xmlns:pic="http://schemas.openxmlformats.org/drawingml/2006/picture">
+                  <pic:nvPicPr>
+                    <pic:cNvPr id="183215646" name=""/>
+                    <pic:cNvPicPr/>
+                  </pic:nvPicPr>
+                  <pic:blipFill>
+                    <a:blip r:embed="rId10"/>
+                    <a:stretch>
+                      <a:fillRect/>
+                    </a:stretch>
+                  </pic:blipFill>
+                  <pic:spPr>
+                    <a:xfrm>
+                      <a:off x="0" y="0"/>
+                      <a:ext cx="5731510" cy="3582035"/>
+                    </a:xfrm>
+                    <a:prstGeom prst="rect">
+                      <a:avLst/>
+                    </a:prstGeom>
+                  </pic:spPr>
+                </pic:pic>
+              </a:graphicData>
+            </a:graphic>
+          </wp:inline>
+        </w:drawing>
+      </w:r>
+    </w:p>
+    <w:p>
+      <w:pPr>
+        <w:jc w:val="center"/>
+        <w:rPr>
+          <w:rFonts w:asciiTheme="majorHAnsi" w:hAnsiTheme="majorHAnsi" w:cstheme="majorHAnsi"/>
+          <w:i/>
+          <w:iCs/>
+          <w:color w:val="404040" w:themeColor="text1" w:themeTint="BF"/>
+        </w:rPr>
+      </w:pPr>
+      <w:r>
+        <w:rPr>
+          <w:rStyle w:val="SubtleEmphasis"/>
+          <w:rFonts w:asciiTheme="majorHAnsi" w:hAnsiTheme="majorHAnsi" w:cstheme="majorHAnsi"/>
+        </w:rPr>
+        <w:t>Hình 2.</w:t>
+      </w:r>
+      <w:r>
+        <w:rPr>
+          <w:rStyle w:val="SubtleEmphasis"/>
+          <w:rFonts w:asciiTheme="majorHAnsi" w:hAnsiTheme="majorHAnsi" w:cstheme="majorHAnsi"/>
+        </w:rPr>
+        <w:t>4</w:t>
+      </w:r>
+      <w:r>
+        <w:rPr>
+          <w:rStyle w:val="SubtleEmphasis"/>
+          <w:rFonts w:asciiTheme="majorHAnsi" w:hAnsiTheme="majorHAnsi" w:cstheme="majorHAnsi"/>
+        </w:rPr>
+        <w:t xml:space="preserve">. layout khi áp dụng </w:t>
+      </w:r>
+      <w:r>
+        <w:rPr>
+          <w:rStyle w:val="SubtleEmphasis"/>
+          <w:rFonts w:asciiTheme="majorHAnsi" w:hAnsiTheme="majorHAnsi" w:cstheme="majorHAnsi"/>
+        </w:rPr>
+        <w:t>scroll (</w:t>
+      </w:r>
+      <w:r>
+        <w:rPr>
+          <w:rStyle w:val="SubtleEmphasis"/>
+          <w:rFonts w:asciiTheme="majorHAnsi" w:hAnsiTheme="majorHAnsi" w:cstheme="majorHAnsi"/>
+        </w:rPr>
+        <w:t>2</w:t>
+      </w:r>
+      <w:r>
+        <w:rPr>
+          <w:rStyle w:val="SubtleEmphasis"/>
+          <w:rFonts w:asciiTheme="majorHAnsi" w:hAnsiTheme="majorHAnsi" w:cstheme="majorHAnsi"/>
+        </w:rPr>
+        <w:t>)</w:t>
+      </w:r>
+    </w:p>
+    <w:p>
+      <w:pPr>
+        <w:jc w:val="both"/>
+        <w:rPr>
+          <w:rFonts w:asciiTheme="majorHAnsi" w:hAnsiTheme="majorHAnsi" w:cstheme="majorHAnsi"/>
+          <w:b/>
+          <w:bCs/>
+          <w:sz w:val="26"/>
+          <w:szCs w:val="26"/>
+          <w:lang w:val="fr-FR"/>
+        </w:rPr>
+      </w:pPr>
+      <w:r>
+        <w:rPr>
+          <w:rFonts w:asciiTheme="majorHAnsi" w:hAnsiTheme="majorHAnsi" w:cstheme="majorHAnsi"/>
+          <w:b/>
+          <w:bCs/>
+          <w:sz w:val="26"/>
+          <w:szCs w:val="26"/>
+          <w:lang w:val="fr-FR"/>
         </w:rPr>
         <w:t>Exercise 3 — Image resilience</w:t>
       </w:r>
     </w:p>
     <w:p>
       <w:pPr>
+        <w:jc w:val="both"/>
         <w:rPr>
           <w:rFonts w:asciiTheme="majorHAnsi" w:hAnsiTheme="majorHAnsi" w:cstheme="majorHAnsi"/>
           <w:b/>
@@ -1520,27 +2447,30 @@
     </w:p>
     <w:p>
       <w:pPr>
-        <w:rPr>
-          <w:rFonts w:asciiTheme="majorHAnsi" w:hAnsiTheme="majorHAnsi" w:cstheme="majorHAnsi"/>
-          <w:b/>
-          <w:bCs/>
-          <w:sz w:val="26"/>
-          <w:szCs w:val="26"/>
-        </w:rPr>
-      </w:pPr>
-      <w:r>
-        <w:rPr>
-          <w:rFonts w:asciiTheme="majorHAnsi" w:hAnsiTheme="majorHAnsi" w:cstheme="majorHAnsi"/>
-          <w:b/>
-          <w:bCs/>
-          <w:sz w:val="26"/>
-          <w:szCs w:val="26"/>
-        </w:rPr>
+        <w:jc w:val="both"/>
+        <w:rPr>
+          <w:rFonts w:asciiTheme="majorHAnsi" w:hAnsiTheme="majorHAnsi" w:cstheme="majorHAnsi"/>
+          <w:b/>
+          <w:bCs/>
+          <w:sz w:val="26"/>
+          <w:szCs w:val="26"/>
+        </w:rPr>
+      </w:pPr>
+      <w:r>
+        <w:rPr>
+          <w:rFonts w:asciiTheme="majorHAnsi" w:hAnsiTheme="majorHAnsi" w:cstheme="majorHAnsi"/>
+          <w:b/>
+          <w:bCs/>
+          <w:sz w:val="26"/>
+          <w:szCs w:val="26"/>
+        </w:rPr>
+        <w:lastRenderedPageBreak/>
         <w:t>Exercise 4 — Press-state system</w:t>
       </w:r>
     </w:p>
     <w:p>
       <w:pPr>
+        <w:jc w:val="both"/>
         <w:rPr>
           <w:rFonts w:asciiTheme="majorHAnsi" w:hAnsiTheme="majorHAnsi" w:cstheme="majorHAnsi"/>
           <w:b/>
@@ -1562,6 +2492,7 @@
     </w:p>
     <w:p>
       <w:pPr>
+        <w:jc w:val="both"/>
         <w:rPr>
           <w:rFonts w:asciiTheme="majorHAnsi" w:hAnsiTheme="majorHAnsi" w:cstheme="majorHAnsi"/>
           <w:b/>
@@ -1583,6 +2514,7 @@
     </w:p>
     <w:p>
       <w:pPr>
+        <w:jc w:val="both"/>
         <w:rPr>
           <w:rFonts w:asciiTheme="majorHAnsi" w:hAnsiTheme="majorHAnsi" w:cstheme="majorHAnsi"/>
           <w:b/>
@@ -1604,6 +2536,7 @@
     </w:p>
     <w:p>
       <w:pPr>
+        <w:jc w:val="both"/>
         <w:rPr>
           <w:rFonts w:asciiTheme="majorHAnsi" w:hAnsiTheme="majorHAnsi" w:cstheme="majorHAnsi"/>
           <w:b/>
@@ -1625,6 +2558,7 @@
     </w:p>
     <w:p>
       <w:pPr>
+        <w:jc w:val="both"/>
         <w:rPr>
           <w:rFonts w:asciiTheme="majorHAnsi" w:hAnsiTheme="majorHAnsi" w:cstheme="majorHAnsi"/>
           <w:b/>
@@ -1646,6 +2580,7 @@
     </w:p>
     <w:p>
       <w:pPr>
+        <w:jc w:val="both"/>
         <w:rPr>
           <w:rFonts w:asciiTheme="majorHAnsi" w:hAnsiTheme="majorHAnsi" w:cstheme="majorHAnsi"/>
           <w:b/>
@@ -1667,6 +2602,7 @@
     </w:p>
     <w:p>
       <w:pPr>
+        <w:jc w:val="both"/>
         <w:rPr>
           <w:rFonts w:asciiTheme="majorHAnsi" w:hAnsiTheme="majorHAnsi" w:cstheme="majorHAnsi"/>
           <w:b/>
@@ -1688,6 +2624,7 @@
     </w:p>
     <w:p>
       <w:pPr>
+        <w:jc w:val="both"/>
         <w:rPr>
           <w:rFonts w:asciiTheme="majorHAnsi" w:hAnsiTheme="majorHAnsi" w:cstheme="majorHAnsi"/>
           <w:b/>
@@ -1709,6 +2646,7 @@
     </w:p>
     <w:p>
       <w:pPr>
+        <w:jc w:val="both"/>
         <w:rPr>
           <w:rFonts w:asciiTheme="majorHAnsi" w:hAnsiTheme="majorHAnsi" w:cstheme="majorHAnsi"/>
           <w:b/>
@@ -1730,28 +2668,29 @@
     </w:p>
     <w:p>
       <w:pPr>
-        <w:rPr>
-          <w:rFonts w:asciiTheme="majorHAnsi" w:hAnsiTheme="majorHAnsi" w:cstheme="majorHAnsi"/>
-          <w:b/>
-          <w:bCs/>
-          <w:sz w:val="26"/>
-          <w:szCs w:val="26"/>
-        </w:rPr>
-      </w:pPr>
-      <w:r>
-        <w:rPr>
-          <w:rFonts w:asciiTheme="majorHAnsi" w:hAnsiTheme="majorHAnsi" w:cstheme="majorHAnsi"/>
-          <w:b/>
-          <w:bCs/>
-          <w:sz w:val="26"/>
-          <w:szCs w:val="26"/>
-        </w:rPr>
-        <w:lastRenderedPageBreak/>
+        <w:jc w:val="both"/>
+        <w:rPr>
+          <w:rFonts w:asciiTheme="majorHAnsi" w:hAnsiTheme="majorHAnsi" w:cstheme="majorHAnsi"/>
+          <w:b/>
+          <w:bCs/>
+          <w:sz w:val="26"/>
+          <w:szCs w:val="26"/>
+        </w:rPr>
+      </w:pPr>
+      <w:r>
+        <w:rPr>
+          <w:rFonts w:asciiTheme="majorHAnsi" w:hAnsiTheme="majorHAnsi" w:cstheme="majorHAnsi"/>
+          <w:b/>
+          <w:bCs/>
+          <w:sz w:val="26"/>
+          <w:szCs w:val="26"/>
+        </w:rPr>
         <w:t>Exercise 9 — Validation copy</w:t>
       </w:r>
     </w:p>
     <w:p>
       <w:pPr>
+        <w:jc w:val="both"/>
         <w:rPr>
           <w:rFonts w:asciiTheme="majorHAnsi" w:hAnsiTheme="majorHAnsi" w:cstheme="majorHAnsi"/>
           <w:b/>
@@ -1773,6 +2712,7 @@
     </w:p>
     <w:p>
       <w:pPr>
+        <w:jc w:val="both"/>
         <w:rPr>
           <w:rFonts w:asciiTheme="majorHAnsi" w:hAnsiTheme="majorHAnsi" w:cstheme="majorHAnsi"/>
           <w:b/>
@@ -1794,6 +2734,7 @@
     </w:p>
     <w:p>
       <w:pPr>
+        <w:jc w:val="both"/>
         <w:rPr>
           <w:rFonts w:asciiTheme="majorHAnsi" w:hAnsiTheme="majorHAnsi" w:cstheme="majorHAnsi"/>
           <w:b/>
@@ -1821,6 +2762,279 @@
     </w:sectPr>
   </w:body>
 </w:document>
+</file>
+
+<file path=word/numbering.xml><?xml version="1.0" encoding="utf-8"?>
+<w:numbering xmlns:wpc="http://schemas.microsoft.com/office/word/2010/wordprocessingCanvas" xmlns:cx="http://schemas.microsoft.com/office/drawing/2014/chartex" xmlns:cx1="http://schemas.microsoft.com/office/drawing/2015/9/8/chartex" xmlns:cx2="http://schemas.microsoft.com/office/drawing/2015/10/21/chartex" xmlns:cx3="http://schemas.microsoft.com/office/drawing/2016/5/9/chartex" xmlns:cx4="http://schemas.microsoft.com/office/drawing/2016/5/10/chartex" xmlns:cx5="http://schemas.microsoft.com/office/drawing/2016/5/11/chartex" xmlns:cx6="http://schemas.microsoft.com/office/drawing/2016/5/12/chartex" xmlns:cx7="http://schemas.microsoft.com/office/drawing/2016/5/13/chartex" xmlns:cx8="http://schemas.microsoft.com/office/drawing/2016/5/14/chartex" xmlns:mc="http://schemas.openxmlformats.org/markup-compatibility/2006" xmlns:aink="http://schemas.microsoft.com/office/drawing/2016/ink" xmlns:am3d="http://schemas.microsoft.com/office/drawing/2017/model3d" xmlns:o="urn:schemas-microsoft-com:office:office" xmlns:oel="http://schemas.microsoft.com/office/2019/extlst" xmlns:r="http://schemas.openxmlformats.org/officeDocument/2006/relationships" xmlns:m="http://schemas.openxmlformats.org/officeDocument/2006/math" xmlns:v="urn:schemas-microsoft-com:vml" xmlns:wp14="http://schemas.microsoft.com/office/word/2010/wordprocessingDrawing" xmlns:wp="http://schemas.openxmlformats.org/drawingml/2006/wordprocessingDrawing" xmlns:w10="urn:schemas-microsoft-com:office:word" xmlns:w="http://schemas.openxmlformats.org/wordprocessingml/2006/main" xmlns:w14="http://schemas.microsoft.com/office/word/2010/wordml" xmlns:w15="http://schemas.microsoft.com/office/word/2012/wordml" xmlns:w16cei="http://schemas.microsoft.com/office/word/2026/wordml/cei" xmlns:w16cex="http://schemas.microsoft.com/office/word/2018/wordml/cex" xmlns:w16cid="http://schemas.microsoft.com/office/word/2016/wordml/cid" xmlns:w16="http://schemas.microsoft.com/office/word/2018/wordml" xmlns:w16du="http://schemas.microsoft.com/office/word/2023/wordml/word16du" xmlns:w16sdtdh="http://schemas.microsoft.com/office/word/2020/wordml/sdtdatahash" xmlns:w16sdtfl="http://schemas.microsoft.com/office/word/2024/wordml/sdtformatlock" xmlns:w16se="http://schemas.microsoft.com/office/word/2015/wordml/symex" xmlns:wpg="http://schemas.microsoft.com/office/word/2010/wordprocessingGroup" xmlns:wpi="http://schemas.microsoft.com/office/word/2010/wordprocessingInk" xmlns:wne="http://schemas.microsoft.com/office/word/2006/wordml" xmlns:wps="http://schemas.microsoft.com/office/word/2010/wordprocessingShape" mc:Ignorable="w14 w15 w16se w16cid w16 w16cex w16sdtdh w16sdtfl w16du wp14">
+  <w:abstractNum w:abstractNumId="0" w15:restartNumberingAfterBreak="0">
+    <w:nsid w:val="27981B82"/>
+    <w:multiLevelType w:val="hybridMultilevel"/>
+    <w:tmpl w:val="F0822E82"/>
+    <w:lvl w:ilvl="0" w:tplc="04090001">
+      <w:start w:val="1"/>
+      <w:numFmt w:val="bullet"/>
+      <w:lvlText w:val=""/>
+      <w:lvlJc w:val="left"/>
+      <w:pPr>
+        <w:ind w:left="1080" w:hanging="360"/>
+      </w:pPr>
+      <w:rPr>
+        <w:rFonts w:ascii="Symbol" w:hAnsi="Symbol" w:hint="default"/>
+      </w:rPr>
+    </w:lvl>
+    <w:lvl w:ilvl="1" w:tplc="04090003" w:tentative="1">
+      <w:start w:val="1"/>
+      <w:numFmt w:val="bullet"/>
+      <w:lvlText w:val="o"/>
+      <w:lvlJc w:val="left"/>
+      <w:pPr>
+        <w:ind w:left="1800" w:hanging="360"/>
+      </w:pPr>
+      <w:rPr>
+        <w:rFonts w:ascii="Courier New" w:hAnsi="Courier New" w:cs="Courier New" w:hint="default"/>
+      </w:rPr>
+    </w:lvl>
+    <w:lvl w:ilvl="2" w:tplc="04090005" w:tentative="1">
+      <w:start w:val="1"/>
+      <w:numFmt w:val="bullet"/>
+      <w:lvlText w:val=""/>
+      <w:lvlJc w:val="left"/>
+      <w:pPr>
+        <w:ind w:left="2520" w:hanging="360"/>
+      </w:pPr>
+      <w:rPr>
+        <w:rFonts w:ascii="Wingdings" w:hAnsi="Wingdings" w:hint="default"/>
+      </w:rPr>
+    </w:lvl>
+    <w:lvl w:ilvl="3" w:tplc="04090001" w:tentative="1">
+      <w:start w:val="1"/>
+      <w:numFmt w:val="bullet"/>
+      <w:lvlText w:val=""/>
+      <w:lvlJc w:val="left"/>
+      <w:pPr>
+        <w:ind w:left="3240" w:hanging="360"/>
+      </w:pPr>
+      <w:rPr>
+        <w:rFonts w:ascii="Symbol" w:hAnsi="Symbol" w:hint="default"/>
+      </w:rPr>
+    </w:lvl>
+    <w:lvl w:ilvl="4" w:tplc="04090003" w:tentative="1">
+      <w:start w:val="1"/>
+      <w:numFmt w:val="bullet"/>
+      <w:lvlText w:val="o"/>
+      <w:lvlJc w:val="left"/>
+      <w:pPr>
+        <w:ind w:left="3960" w:hanging="360"/>
+      </w:pPr>
+      <w:rPr>
+        <w:rFonts w:ascii="Courier New" w:hAnsi="Courier New" w:cs="Courier New" w:hint="default"/>
+      </w:rPr>
+    </w:lvl>
+    <w:lvl w:ilvl="5" w:tplc="04090005" w:tentative="1">
+      <w:start w:val="1"/>
+      <w:numFmt w:val="bullet"/>
+      <w:lvlText w:val=""/>
+      <w:lvlJc w:val="left"/>
+      <w:pPr>
+        <w:ind w:left="4680" w:hanging="360"/>
+      </w:pPr>
+      <w:rPr>
+        <w:rFonts w:ascii="Wingdings" w:hAnsi="Wingdings" w:hint="default"/>
+      </w:rPr>
+    </w:lvl>
+    <w:lvl w:ilvl="6" w:tplc="04090001" w:tentative="1">
+      <w:start w:val="1"/>
+      <w:numFmt w:val="bullet"/>
+      <w:lvlText w:val=""/>
+      <w:lvlJc w:val="left"/>
+      <w:pPr>
+        <w:ind w:left="5400" w:hanging="360"/>
+      </w:pPr>
+      <w:rPr>
+        <w:rFonts w:ascii="Symbol" w:hAnsi="Symbol" w:hint="default"/>
+      </w:rPr>
+    </w:lvl>
+    <w:lvl w:ilvl="7" w:tplc="04090003" w:tentative="1">
+      <w:start w:val="1"/>
+      <w:numFmt w:val="bullet"/>
+      <w:lvlText w:val="o"/>
+      <w:lvlJc w:val="left"/>
+      <w:pPr>
+        <w:ind w:left="6120" w:hanging="360"/>
+      </w:pPr>
+      <w:rPr>
+        <w:rFonts w:ascii="Courier New" w:hAnsi="Courier New" w:cs="Courier New" w:hint="default"/>
+      </w:rPr>
+    </w:lvl>
+    <w:lvl w:ilvl="8" w:tplc="04090005" w:tentative="1">
+      <w:start w:val="1"/>
+      <w:numFmt w:val="bullet"/>
+      <w:lvlText w:val=""/>
+      <w:lvlJc w:val="left"/>
+      <w:pPr>
+        <w:ind w:left="6840" w:hanging="360"/>
+      </w:pPr>
+      <w:rPr>
+        <w:rFonts w:ascii="Wingdings" w:hAnsi="Wingdings" w:hint="default"/>
+      </w:rPr>
+    </w:lvl>
+  </w:abstractNum>
+  <w:abstractNum w:abstractNumId="1" w15:restartNumberingAfterBreak="0">
+    <w:nsid w:val="3B613DF9"/>
+    <w:multiLevelType w:val="multilevel"/>
+    <w:tmpl w:val="75DA8D24"/>
+    <w:lvl w:ilvl="0">
+      <w:start w:val="1"/>
+      <w:numFmt w:val="bullet"/>
+      <w:lvlText w:val=""/>
+      <w:lvlJc w:val="left"/>
+      <w:pPr>
+        <w:tabs>
+          <w:tab w:val="num" w:pos="720"/>
+        </w:tabs>
+        <w:ind w:left="720" w:hanging="360"/>
+      </w:pPr>
+      <w:rPr>
+        <w:rFonts w:ascii="Symbol" w:hAnsi="Symbol" w:hint="default"/>
+        <w:sz w:val="20"/>
+      </w:rPr>
+    </w:lvl>
+    <w:lvl w:ilvl="1" w:tentative="1">
+      <w:start w:val="1"/>
+      <w:numFmt w:val="bullet"/>
+      <w:lvlText w:val="o"/>
+      <w:lvlJc w:val="left"/>
+      <w:pPr>
+        <w:tabs>
+          <w:tab w:val="num" w:pos="1440"/>
+        </w:tabs>
+        <w:ind w:left="1440" w:hanging="360"/>
+      </w:pPr>
+      <w:rPr>
+        <w:rFonts w:ascii="Courier New" w:hAnsi="Courier New" w:hint="default"/>
+        <w:sz w:val="20"/>
+      </w:rPr>
+    </w:lvl>
+    <w:lvl w:ilvl="2" w:tentative="1">
+      <w:start w:val="1"/>
+      <w:numFmt w:val="bullet"/>
+      <w:lvlText w:val=""/>
+      <w:lvlJc w:val="left"/>
+      <w:pPr>
+        <w:tabs>
+          <w:tab w:val="num" w:pos="2160"/>
+        </w:tabs>
+        <w:ind w:left="2160" w:hanging="360"/>
+      </w:pPr>
+      <w:rPr>
+        <w:rFonts w:ascii="Wingdings" w:hAnsi="Wingdings" w:hint="default"/>
+        <w:sz w:val="20"/>
+      </w:rPr>
+    </w:lvl>
+    <w:lvl w:ilvl="3" w:tentative="1">
+      <w:start w:val="1"/>
+      <w:numFmt w:val="bullet"/>
+      <w:lvlText w:val=""/>
+      <w:lvlJc w:val="left"/>
+      <w:pPr>
+        <w:tabs>
+          <w:tab w:val="num" w:pos="2880"/>
+        </w:tabs>
+        <w:ind w:left="2880" w:hanging="360"/>
+      </w:pPr>
+      <w:rPr>
+        <w:rFonts w:ascii="Wingdings" w:hAnsi="Wingdings" w:hint="default"/>
+        <w:sz w:val="20"/>
+      </w:rPr>
+    </w:lvl>
+    <w:lvl w:ilvl="4" w:tentative="1">
+      <w:start w:val="1"/>
+      <w:numFmt w:val="bullet"/>
+      <w:lvlText w:val=""/>
+      <w:lvlJc w:val="left"/>
+      <w:pPr>
+        <w:tabs>
+          <w:tab w:val="num" w:pos="3600"/>
+        </w:tabs>
+        <w:ind w:left="3600" w:hanging="360"/>
+      </w:pPr>
+      <w:rPr>
+        <w:rFonts w:ascii="Wingdings" w:hAnsi="Wingdings" w:hint="default"/>
+        <w:sz w:val="20"/>
+      </w:rPr>
+    </w:lvl>
+    <w:lvl w:ilvl="5" w:tentative="1">
+      <w:start w:val="1"/>
+      <w:numFmt w:val="bullet"/>
+      <w:lvlText w:val=""/>
+      <w:lvlJc w:val="left"/>
+      <w:pPr>
+        <w:tabs>
+          <w:tab w:val="num" w:pos="4320"/>
+        </w:tabs>
+        <w:ind w:left="4320" w:hanging="360"/>
+      </w:pPr>
+      <w:rPr>
+        <w:rFonts w:ascii="Wingdings" w:hAnsi="Wingdings" w:hint="default"/>
+        <w:sz w:val="20"/>
+      </w:rPr>
+    </w:lvl>
+    <w:lvl w:ilvl="6" w:tentative="1">
+      <w:start w:val="1"/>
+      <w:numFmt w:val="bullet"/>
+      <w:lvlText w:val=""/>
+      <w:lvlJc w:val="left"/>
+      <w:pPr>
+        <w:tabs>
+          <w:tab w:val="num" w:pos="5040"/>
+        </w:tabs>
+        <w:ind w:left="5040" w:hanging="360"/>
+      </w:pPr>
+      <w:rPr>
+        <w:rFonts w:ascii="Wingdings" w:hAnsi="Wingdings" w:hint="default"/>
+        <w:sz w:val="20"/>
+      </w:rPr>
+    </w:lvl>
+    <w:lvl w:ilvl="7" w:tentative="1">
+      <w:start w:val="1"/>
+      <w:numFmt w:val="bullet"/>
+      <w:lvlText w:val=""/>
+      <w:lvlJc w:val="left"/>
+      <w:pPr>
+        <w:tabs>
+          <w:tab w:val="num" w:pos="5760"/>
+        </w:tabs>
+        <w:ind w:left="5760" w:hanging="360"/>
+      </w:pPr>
+      <w:rPr>
+        <w:rFonts w:ascii="Wingdings" w:hAnsi="Wingdings" w:hint="default"/>
+        <w:sz w:val="20"/>
+      </w:rPr>
+    </w:lvl>
+    <w:lvl w:ilvl="8" w:tentative="1">
+      <w:start w:val="1"/>
+      <w:numFmt w:val="bullet"/>
+      <w:lvlText w:val=""/>
+      <w:lvlJc w:val="left"/>
+      <w:pPr>
+        <w:tabs>
+          <w:tab w:val="num" w:pos="6480"/>
+        </w:tabs>
+        <w:ind w:left="6480" w:hanging="360"/>
+      </w:pPr>
+      <w:rPr>
+        <w:rFonts w:ascii="Wingdings" w:hAnsi="Wingdings" w:hint="default"/>
+        <w:sz w:val="20"/>
+      </w:rPr>
+    </w:lvl>
+  </w:abstractNum>
+  <w:num w:numId="1" w16cid:durableId="427235427">
+    <w:abstractNumId w:val="1"/>
+  </w:num>
+  <w:num w:numId="2" w16cid:durableId="653725203">
+    <w:abstractNumId w:val="0"/>
+  </w:num>
+</w:numbering>
 </file>
 
 <file path=word/styles.xml><?xml version="1.0" encoding="utf-8"?>
@@ -2223,7 +3437,7 @@
   <w:style w:type="paragraph" w:default="1" w:styleId="Normal">
     <w:name w:val="Normal"/>
     <w:qFormat/>
-    <w:rsid w:val="008648B3"/>
+    <w:rsid w:val="00E840F4"/>
   </w:style>
   <w:style w:type="paragraph" w:styleId="Heading1">
     <w:name w:val="heading 1"/>
@@ -2807,6 +4021,18 @@
       <w:u w:val="single"/>
     </w:rPr>
   </w:style>
+  <w:style w:type="character" w:styleId="SubtleEmphasis">
+    <w:name w:val="Subtle Emphasis"/>
+    <w:basedOn w:val="DefaultParagraphFont"/>
+    <w:uiPriority w:val="19"/>
+    <w:qFormat/>
+    <w:rsid w:val="00F52ADF"/>
+    <w:rPr>
+      <w:i/>
+      <w:iCs/>
+      <w:color w:val="404040" w:themeColor="text1" w:themeTint="BF"/>
+    </w:rPr>
+  </w:style>
 </w:styles>
 </file>
 

</xml_diff>